<commit_message>
adding updated scope file
</commit_message>
<xml_diff>
--- a/Project Documents/Scope.docx
+++ b/Project Documents/Scope.docx
@@ -78,7 +78,11 @@
           <w:tcPr>
             <w:tcW w:w="2254" w:type="dxa"/>
           </w:tcPr>
-          <w:p/>
+          <w:p>
+            <w:r>
+              <w:t>Finlay Slater</w:t>
+            </w:r>
+          </w:p>
         </w:tc>
       </w:tr>
       <w:tr>
@@ -115,7 +119,11 @@
           <w:tcPr>
             <w:tcW w:w="2254" w:type="dxa"/>
           </w:tcPr>
-          <w:p/>
+          <w:p>
+            <w:r>
+              <w:t>22/10/2026</w:t>
+            </w:r>
+          </w:p>
         </w:tc>
       </w:tr>
       <w:tr>
@@ -153,11 +161,9 @@
             <w:r>
               <w:t xml:space="preserve">Install sensor network within pilot buildings (Sensors will measure occupancy, </w:t>
             </w:r>
-            <w:proofErr w:type="gramStart"/>
-            <w:r>
-              <w:t>temperature ,</w:t>
-            </w:r>
-            <w:proofErr w:type="gramEnd"/>
+            <w:r>
+              <w:t>temperature,</w:t>
+            </w:r>
             <w:r>
               <w:t xml:space="preserve"> lighting and energy measuring sensors)</w:t>
             </w:r>
@@ -173,6 +179,57 @@
             <w:r>
               <w:t>Develop and deploy</w:t>
             </w:r>
+            <w:r>
+              <w:t xml:space="preserve"> a central management dashboard for system to report figures for UWE staff</w:t>
+            </w:r>
+          </w:p>
+          <w:p>
+            <w:pPr>
+              <w:pStyle w:val="ListParagraph"/>
+              <w:numPr>
+                <w:ilvl w:val="0"/>
+                <w:numId w:val="4"/>
+              </w:numPr>
+            </w:pPr>
+            <w:r>
+              <w:t>Integrate sensor data to UWE infrastructure to reduce energy usage within buildings</w:t>
+            </w:r>
+          </w:p>
+          <w:p>
+            <w:pPr>
+              <w:pStyle w:val="ListParagraph"/>
+              <w:numPr>
+                <w:ilvl w:val="0"/>
+                <w:numId w:val="4"/>
+              </w:numPr>
+            </w:pPr>
+            <w:r>
+              <w:t>Issue training to facility management team</w:t>
+            </w:r>
+          </w:p>
+          <w:p>
+            <w:pPr>
+              <w:pStyle w:val="ListParagraph"/>
+              <w:numPr>
+                <w:ilvl w:val="0"/>
+                <w:numId w:val="4"/>
+              </w:numPr>
+            </w:pPr>
+            <w:r>
+              <w:t>Commission the system to ensure compliance with current infrastructure</w:t>
+            </w:r>
+          </w:p>
+          <w:p>
+            <w:pPr>
+              <w:pStyle w:val="ListParagraph"/>
+              <w:numPr>
+                <w:ilvl w:val="0"/>
+                <w:numId w:val="4"/>
+              </w:numPr>
+            </w:pPr>
+            <w:r>
+              <w:t>Report energy savings against a pre project baseline reported.</w:t>
+            </w:r>
           </w:p>
           <w:p>
             <w:r>
@@ -187,6 +244,63 @@
                 <w:numId w:val="4"/>
               </w:numPr>
             </w:pPr>
+            <w:r>
+              <w:t>Issuing the system beyond pilot building</w:t>
+            </w:r>
+          </w:p>
+          <w:p>
+            <w:pPr>
+              <w:pStyle w:val="ListParagraph"/>
+              <w:numPr>
+                <w:ilvl w:val="0"/>
+                <w:numId w:val="4"/>
+              </w:numPr>
+            </w:pPr>
+            <w:r>
+              <w:t>Installing alternative methods of generating energy</w:t>
+            </w:r>
+          </w:p>
+          <w:p>
+            <w:pPr>
+              <w:pStyle w:val="ListParagraph"/>
+              <w:numPr>
+                <w:ilvl w:val="0"/>
+                <w:numId w:val="4"/>
+              </w:numPr>
+            </w:pPr>
+            <w:r>
+              <w:t>Major modifications to HVAC, lighting and electrical infrastructure</w:t>
+            </w:r>
+          </w:p>
+          <w:p>
+            <w:pPr>
+              <w:pStyle w:val="ListParagraph"/>
+              <w:numPr>
+                <w:ilvl w:val="0"/>
+                <w:numId w:val="4"/>
+              </w:numPr>
+            </w:pPr>
+            <w:r>
+              <w:t xml:space="preserve">Giving alternative methods to report data </w:t>
+            </w:r>
+            <w:r>
+              <w:t>outside of</w:t>
+            </w:r>
+            <w:r>
+              <w:t xml:space="preserve"> central management dashboard</w:t>
+            </w:r>
+          </w:p>
+          <w:p>
+            <w:pPr>
+              <w:pStyle w:val="ListParagraph"/>
+              <w:numPr>
+                <w:ilvl w:val="0"/>
+                <w:numId w:val="4"/>
+              </w:numPr>
+            </w:pPr>
+            <w:r>
+              <w:t>Ongoing support of the project beyond the deadline</w:t>
+            </w:r>
           </w:p>
         </w:tc>
       </w:tr>
@@ -218,13 +332,7 @@
               </w:numPr>
             </w:pPr>
             <w:r>
-              <w:t xml:space="preserve">Install and maintain a smart campus system utilising data produced by UWE and a sensor network to </w:t>
-            </w:r>
-            <w:r>
-              <w:t>monitor and optimise</w:t>
-            </w:r>
-            <w:r>
-              <w:t xml:space="preserve"> energy usage through selected pilot buildings. </w:t>
+              <w:t xml:space="preserve">Sensor network is installed and provides outputs to central management system </w:t>
             </w:r>
           </w:p>
           <w:p>
@@ -236,7 +344,7 @@
               </w:numPr>
             </w:pPr>
             <w:r>
-              <w:t>Provide a dashboard for facility team to monitor system easily</w:t>
+              <w:t xml:space="preserve">Central management system provides real time and historical data of sensor network </w:t>
             </w:r>
           </w:p>
           <w:p>
@@ -248,7 +356,7 @@
               </w:numPr>
             </w:pPr>
             <w:r>
-              <w:t>Provide training material for facility staff.</w:t>
+              <w:t>User guide for central management system</w:t>
             </w:r>
           </w:p>
           <w:p>
@@ -259,6 +367,57 @@
                 <w:numId w:val="1"/>
               </w:numPr>
             </w:pPr>
+            <w:r>
+              <w:t>Sensor data can be used to actuate lighting HVAC and electrical infrastructure.</w:t>
+            </w:r>
+          </w:p>
+          <w:p>
+            <w:pPr>
+              <w:pStyle w:val="ListParagraph"/>
+              <w:numPr>
+                <w:ilvl w:val="0"/>
+                <w:numId w:val="1"/>
+              </w:numPr>
+            </w:pPr>
+            <w:r>
+              <w:t>Risk assessment and compliance documentation of system</w:t>
+            </w:r>
+          </w:p>
+          <w:p>
+            <w:pPr>
+              <w:pStyle w:val="ListParagraph"/>
+              <w:numPr>
+                <w:ilvl w:val="0"/>
+                <w:numId w:val="1"/>
+              </w:numPr>
+            </w:pPr>
+            <w:r>
+              <w:t>Maintenance and support manual for system</w:t>
+            </w:r>
+          </w:p>
+          <w:p>
+            <w:pPr>
+              <w:pStyle w:val="ListParagraph"/>
+              <w:numPr>
+                <w:ilvl w:val="0"/>
+                <w:numId w:val="1"/>
+              </w:numPr>
+            </w:pPr>
+            <w:r>
+              <w:t>Training session for facility management team</w:t>
+            </w:r>
+          </w:p>
+          <w:p>
+            <w:pPr>
+              <w:pStyle w:val="ListParagraph"/>
+              <w:numPr>
+                <w:ilvl w:val="0"/>
+                <w:numId w:val="1"/>
+              </w:numPr>
+            </w:pPr>
+            <w:r>
+              <w:t>Provide an output for savings with smart system compared to baseline energy usage</w:t>
+            </w:r>
           </w:p>
         </w:tc>
       </w:tr>
@@ -292,6 +451,54 @@
             <w:r>
               <w:t xml:space="preserve">Installation of sensor network and dashboard </w:t>
             </w:r>
+            <w:r>
+              <w:t xml:space="preserve">and verify they are operational </w:t>
+            </w:r>
+          </w:p>
+          <w:p>
+            <w:pPr>
+              <w:pStyle w:val="ListParagraph"/>
+              <w:numPr>
+                <w:ilvl w:val="0"/>
+                <w:numId w:val="3"/>
+              </w:numPr>
+            </w:pPr>
+            <w:r>
+              <w:t>Facility management staff are comfortable navigating dashboard</w:t>
+            </w:r>
+          </w:p>
+          <w:p>
+            <w:pPr>
+              <w:pStyle w:val="ListParagraph"/>
+              <w:numPr>
+                <w:ilvl w:val="0"/>
+                <w:numId w:val="3"/>
+              </w:numPr>
+            </w:pPr>
+            <w:r>
+              <w:t xml:space="preserve">Project delivered within budget and </w:t>
+            </w:r>
+            <w:proofErr w:type="gramStart"/>
+            <w:r>
+              <w:t>time period</w:t>
+            </w:r>
+            <w:proofErr w:type="gramEnd"/>
+            <w:r>
+              <w:t xml:space="preserve"> defined in constraints </w:t>
+            </w:r>
+          </w:p>
+          <w:p>
+            <w:pPr>
+              <w:pStyle w:val="ListParagraph"/>
+              <w:numPr>
+                <w:ilvl w:val="0"/>
+                <w:numId w:val="3"/>
+              </w:numPr>
+            </w:pPr>
+            <w:r>
+              <w:lastRenderedPageBreak/>
+              <w:t>Energy usage reports a lower energy usage than pre project baseline provided</w:t>
+            </w:r>
           </w:p>
         </w:tc>
       </w:tr>
@@ -305,6 +512,7 @@
               <w:jc w:val="center"/>
             </w:pPr>
             <w:r>
+              <w:lastRenderedPageBreak/>
               <w:t>Constraints</w:t>
             </w:r>
           </w:p>
@@ -383,7 +591,62 @@
             <w:tcW w:w="6186" w:type="dxa"/>
             <w:gridSpan w:val="3"/>
           </w:tcPr>
-          <w:p/>
+          <w:p>
+            <w:pPr>
+              <w:pStyle w:val="ListParagraph"/>
+              <w:numPr>
+                <w:ilvl w:val="0"/>
+                <w:numId w:val="5"/>
+              </w:numPr>
+            </w:pPr>
+            <w:r>
+              <w:t xml:space="preserve">Existing infrastructure in place at UWE </w:t>
+            </w:r>
+          </w:p>
+          <w:p>
+            <w:pPr>
+              <w:pStyle w:val="ListParagraph"/>
+              <w:numPr>
+                <w:ilvl w:val="0"/>
+                <w:numId w:val="5"/>
+              </w:numPr>
+            </w:pPr>
+            <w:r>
+              <w:t xml:space="preserve">There will be no major interference with project causing significant delay </w:t>
+            </w:r>
+          </w:p>
+          <w:p>
+            <w:pPr>
+              <w:pStyle w:val="ListParagraph"/>
+              <w:numPr>
+                <w:ilvl w:val="0"/>
+                <w:numId w:val="5"/>
+              </w:numPr>
+            </w:pPr>
+            <w:r>
+              <w:t xml:space="preserve">Appropriate time defined in project will be provided to install sensors </w:t>
+            </w:r>
+            <w:proofErr w:type="gramStart"/>
+            <w:r>
+              <w:t>with in</w:t>
+            </w:r>
+            <w:proofErr w:type="gramEnd"/>
+            <w:r>
+              <w:t xml:space="preserve"> buildings </w:t>
+            </w:r>
+          </w:p>
+          <w:p>
+            <w:pPr>
+              <w:pStyle w:val="ListParagraph"/>
+              <w:numPr>
+                <w:ilvl w:val="0"/>
+                <w:numId w:val="5"/>
+              </w:numPr>
+            </w:pPr>
+            <w:r>
+              <w:t>A baseline energy usage is provided by stakeholders with evidence for the value provided</w:t>
+            </w:r>
+          </w:p>
         </w:tc>
       </w:tr>
     </w:tbl>
@@ -740,6 +1003,119 @@
     </w:lvl>
   </w:abstractNum>
   <w:abstractNum w:abstractNumId="3" w15:restartNumberingAfterBreak="0">
+    <w:nsid w:val="61E60B8F"/>
+    <w:multiLevelType w:val="hybridMultilevel"/>
+    <w:tmpl w:val="2B84D9DC"/>
+    <w:lvl w:ilvl="0" w:tplc="08090001">
+      <w:start w:val="1"/>
+      <w:numFmt w:val="bullet"/>
+      <w:lvlText w:val=""/>
+      <w:lvlJc w:val="left"/>
+      <w:pPr>
+        <w:ind w:left="720" w:hanging="360"/>
+      </w:pPr>
+      <w:rPr>
+        <w:rFonts w:ascii="Symbol" w:hAnsi="Symbol" w:hint="default"/>
+      </w:rPr>
+    </w:lvl>
+    <w:lvl w:ilvl="1" w:tplc="08090003" w:tentative="1">
+      <w:start w:val="1"/>
+      <w:numFmt w:val="bullet"/>
+      <w:lvlText w:val="o"/>
+      <w:lvlJc w:val="left"/>
+      <w:pPr>
+        <w:ind w:left="1440" w:hanging="360"/>
+      </w:pPr>
+      <w:rPr>
+        <w:rFonts w:ascii="Courier New" w:hAnsi="Courier New" w:cs="Courier New" w:hint="default"/>
+      </w:rPr>
+    </w:lvl>
+    <w:lvl w:ilvl="2" w:tplc="08090005" w:tentative="1">
+      <w:start w:val="1"/>
+      <w:numFmt w:val="bullet"/>
+      <w:lvlText w:val=""/>
+      <w:lvlJc w:val="left"/>
+      <w:pPr>
+        <w:ind w:left="2160" w:hanging="360"/>
+      </w:pPr>
+      <w:rPr>
+        <w:rFonts w:ascii="Wingdings" w:hAnsi="Wingdings" w:hint="default"/>
+      </w:rPr>
+    </w:lvl>
+    <w:lvl w:ilvl="3" w:tplc="08090001" w:tentative="1">
+      <w:start w:val="1"/>
+      <w:numFmt w:val="bullet"/>
+      <w:lvlText w:val=""/>
+      <w:lvlJc w:val="left"/>
+      <w:pPr>
+        <w:ind w:left="2880" w:hanging="360"/>
+      </w:pPr>
+      <w:rPr>
+        <w:rFonts w:ascii="Symbol" w:hAnsi="Symbol" w:hint="default"/>
+      </w:rPr>
+    </w:lvl>
+    <w:lvl w:ilvl="4" w:tplc="08090003" w:tentative="1">
+      <w:start w:val="1"/>
+      <w:numFmt w:val="bullet"/>
+      <w:lvlText w:val="o"/>
+      <w:lvlJc w:val="left"/>
+      <w:pPr>
+        <w:ind w:left="3600" w:hanging="360"/>
+      </w:pPr>
+      <w:rPr>
+        <w:rFonts w:ascii="Courier New" w:hAnsi="Courier New" w:cs="Courier New" w:hint="default"/>
+      </w:rPr>
+    </w:lvl>
+    <w:lvl w:ilvl="5" w:tplc="08090005" w:tentative="1">
+      <w:start w:val="1"/>
+      <w:numFmt w:val="bullet"/>
+      <w:lvlText w:val=""/>
+      <w:lvlJc w:val="left"/>
+      <w:pPr>
+        <w:ind w:left="4320" w:hanging="360"/>
+      </w:pPr>
+      <w:rPr>
+        <w:rFonts w:ascii="Wingdings" w:hAnsi="Wingdings" w:hint="default"/>
+      </w:rPr>
+    </w:lvl>
+    <w:lvl w:ilvl="6" w:tplc="08090001" w:tentative="1">
+      <w:start w:val="1"/>
+      <w:numFmt w:val="bullet"/>
+      <w:lvlText w:val=""/>
+      <w:lvlJc w:val="left"/>
+      <w:pPr>
+        <w:ind w:left="5040" w:hanging="360"/>
+      </w:pPr>
+      <w:rPr>
+        <w:rFonts w:ascii="Symbol" w:hAnsi="Symbol" w:hint="default"/>
+      </w:rPr>
+    </w:lvl>
+    <w:lvl w:ilvl="7" w:tplc="08090003" w:tentative="1">
+      <w:start w:val="1"/>
+      <w:numFmt w:val="bullet"/>
+      <w:lvlText w:val="o"/>
+      <w:lvlJc w:val="left"/>
+      <w:pPr>
+        <w:ind w:left="5760" w:hanging="360"/>
+      </w:pPr>
+      <w:rPr>
+        <w:rFonts w:ascii="Courier New" w:hAnsi="Courier New" w:cs="Courier New" w:hint="default"/>
+      </w:rPr>
+    </w:lvl>
+    <w:lvl w:ilvl="8" w:tplc="08090005" w:tentative="1">
+      <w:start w:val="1"/>
+      <w:numFmt w:val="bullet"/>
+      <w:lvlText w:val=""/>
+      <w:lvlJc w:val="left"/>
+      <w:pPr>
+        <w:ind w:left="6480" w:hanging="360"/>
+      </w:pPr>
+      <w:rPr>
+        <w:rFonts w:ascii="Wingdings" w:hAnsi="Wingdings" w:hint="default"/>
+      </w:rPr>
+    </w:lvl>
+  </w:abstractNum>
+  <w:abstractNum w:abstractNumId="4" w15:restartNumberingAfterBreak="0">
     <w:nsid w:val="6E921B44"/>
     <w:multiLevelType w:val="hybridMultilevel"/>
     <w:tmpl w:val="78BAD4C4"/>
@@ -856,13 +1232,16 @@
     <w:abstractNumId w:val="1"/>
   </w:num>
   <w:num w:numId="2" w16cid:durableId="1452479351">
-    <w:abstractNumId w:val="3"/>
+    <w:abstractNumId w:val="4"/>
   </w:num>
   <w:num w:numId="3" w16cid:durableId="1164272698">
     <w:abstractNumId w:val="2"/>
   </w:num>
   <w:num w:numId="4" w16cid:durableId="494301449">
     <w:abstractNumId w:val="0"/>
+  </w:num>
+  <w:num w:numId="5" w16cid:durableId="1052968965">
+    <w:abstractNumId w:val="3"/>
   </w:num>
 </w:numbering>
 </file>

</xml_diff>

<commit_message>
adding scope updtaed and Meeting Minutes/22_10_2026 meeting minutes.docx
</commit_message>
<xml_diff>
--- a/Project Documents/Scope.docx
+++ b/Project Documents/Scope.docx
@@ -368,7 +368,7 @@
               </w:numPr>
             </w:pPr>
             <w:r>
-              <w:t>Sensor data can be used to actuate lighting HVAC and electrical infrastructure.</w:t>
+              <w:t>Sensor data will provide recommendations to central management system to increase energy savings</w:t>
             </w:r>
           </w:p>
           <w:p>
@@ -466,6 +466,9 @@
             <w:r>
               <w:t>Facility management staff are comfortable navigating dashboard</w:t>
             </w:r>
+            <w:r>
+              <w:t xml:space="preserve"> and can report and access data as required</w:t>
+            </w:r>
           </w:p>
           <w:p>
             <w:pPr>
@@ -476,6 +479,7 @@
               </w:numPr>
             </w:pPr>
             <w:r>
+              <w:lastRenderedPageBreak/>
               <w:t xml:space="preserve">Project delivered within budget and </w:t>
             </w:r>
             <w:proofErr w:type="gramStart"/>
@@ -496,7 +500,6 @@
               </w:numPr>
             </w:pPr>
             <w:r>
-              <w:lastRenderedPageBreak/>
               <w:t>Energy usage reports a lower energy usage than pre project baseline provided</w:t>
             </w:r>
           </w:p>

</xml_diff>